<commit_message>
Shorten lab 2 report
</commit_message>
<xml_diff>
--- a/SOA_lab2_67607_P3408.docx
+++ b/SOA_lab2_67607_P3408.docx
@@ -718,7 +718,7 @@
         <w:spacing w:after="120" w:line="300" w:lineRule="auto"/>
       </w:pPr>
       <w:r>
-        <w:t>Все три сервиса из спецификации первой лабораторной работы (Ticket, Person и Booking) реализованы на Spring Boot 3.5 (Spring MVC REST) и собираются в WAR-архивы. Интерфейсы контроллеров и модели запросов и ответов сгенерированы из YAML-спецификаций плагином openapi-generator-maven-plugin (генератор spring, режим interfaceOnly), поэтому пути, параметры, типы и ограничения полей совпадают со спецификацией. Booking Service вызывает API Ticket Service и Person Service через клиентов, сгенерированных из тех же спецификаций (генератор java, библиотека restclient).</w:t>
+        <w:t xml:space="preserve">Все три сервиса (Ticket, Person и Booking) реализованы на Spring Boot 3.5 (Spring MVC REST) и собираются в WAR-архивы. Интерфейсы контроллеров и модели сгенерированы из YAML-спецификаций плагином openapi-generator-maven-plugin, поэтому API совпадает со спецификацией. Booking Service вызывает Ticket Service и Person Service через клиенты, сгенерированные из тех же спецификаций.</w:t>
       </w:r>
     </w:p>
     <w:p>
@@ -726,7 +726,7 @@
         <w:spacing w:after="120" w:line="300" w:lineRule="auto"/>
       </w:pPr>
       <w:r>
-        <w:t>Каждый сервис разделён на слои, разложенные по пакетам controller, service, repository и entity: контроллер реализует сгенерированный интерфейс и формирует HTTP-ответ, сервис содержит бизнес-логику и транзакции, репозиторий (Spring Data JPA) работает с базой PostgreSQL, сущности описывают её таблицы. Общий для всех сервисов код вынесен в модуль common:</w:t>
+        <w:t xml:space="preserve">Код каждого сервиса разложен по пакетам controller, service, repository и entity. Общий код вынесен в модуль common:</w:t>
       </w:r>
     </w:p>
     <w:p>
@@ -739,7 +739,7 @@
         <w:spacing w:after="60" w:line="300" w:lineRule="auto"/>
       </w:pPr>
       <w:r>
-        <w:t>единый формат ошибки {message, time, details} и сопоставление ошибок с кодами 400, 404, 409, 422, 500 и 503; тексты ошибок не заданы в коде, а вынесены в файлы сообщений messages.properties и подставляются через MessageSource;</w:t>
+        <w:t xml:space="preserve">единый формат ошибки {message, time, details}, тексты ошибок хранятся в messages.properties</w:t>
       </w:r>
     </w:p>
     <w:p>
@@ -752,7 +752,7 @@
         <w:spacing w:after="60" w:line="300" w:lineRule="auto"/>
       </w:pPr>
       <w:r>
-        <w:t>разбор параметров filter и sort, проверка противоречивых условий, постраничная выборка;</w:t>
+        <w:t xml:space="preserve">фильтрация, сортировка и постраничная выборка</w:t>
       </w:r>
     </w:p>
     <w:p>
@@ -765,8 +765,7 @@
         <w:spacing w:after="60" w:line="300" w:lineRule="auto"/>
       </w:pPr>
       <w:r>
-        <w:lastRenderedPageBreak/>
-        <w:t>строгая обработка JSON: неизвестные поля, неверные типы и нарушения ограничений возвращаются одним ответом 422 со списком всех ошибок в details.</w:t>
+        <w:t xml:space="preserve">проверка JSON запроса: все нарушения возвращаются одним ответом 422 со списком в details</w:t>
       </w:r>
     </w:p>
     <w:p>
@@ -793,7 +792,7 @@
         <w:spacing w:after="120" w:line="300" w:lineRule="auto"/>
       </w:pPr>
       <w:r>
-        <w:t>Каждый сервис развёрнут в отдельном экземпляре сервера приложений Tomcat 10.1.60 на helios. Booking Service обращается к Ticket Service и Person Service по https.</w:t>
+        <w:t xml:space="preserve">Каждый сервис развёрнут в отдельном экземпляре Tomcat 10.1.60 на helios.</w:t>
       </w:r>
     </w:p>
     <w:p>
@@ -801,7 +800,7 @@
         <w:spacing w:after="120" w:line="300" w:lineRule="auto"/>
       </w:pPr>
       <w:r>
-        <w:t>Порты Tomcat на helios закрыты для внешних подключений, поэтому доступ снаружи организован через веб-сервер se.ifmo.ru, раздающий каталог public_html. Для каждого сервиса в public_html создан каталог, в котором правило .htaccess передаёт все запросы скрипту-посреднику. Скрипт без изменений пересылает метод, путь, параметры и тело запроса в Tomcat соответствующего сервиса по https и возвращает ответ. Клиентское приложение размещено в каталоге public_html/lab2.</w:t>
+        <w:t xml:space="preserve">Порты Tomcat закрыты снаружи, поэтому запросы идут через se.ifmo.ru. Для каждого сервиса в public_html есть каталог с .htaccess и скриптом, который пересылает запрос в Tomcat по https и возвращает ответ. Клиент лежит в public_html/lab2.</w:t>
       </w:r>
     </w:p>
     <w:tbl>
@@ -1344,16 +1343,7 @@
         </w:rPr>
       </w:pPr>
       <w:r>
-        <w:t>Самоподписанный сертификат сервера создан утилитой keytool. Хранилище ключа keystore.p12 и хранилище доверенных сертификатов truststore.p12 находятся в репозитории, а пути к ним и пароли указаны в конфигурации приложения: в server.xml экземпляра Tomcat и в application.properties Booking Service (Spring SSL bundle), поэтому при развёртывании ключи не генерируются и не передаются через окружение</w:t>
-      </w:r>
-      <w:r>
-        <w:rPr>
-          <w:lang w:val="ru-RU"/>
-        </w:rPr>
-        <w:t xml:space="preserve">. </w:t>
-      </w:r>
-      <w:r>
-        <w:t>В конфигурации server.xml каждого экземпляра Tomcat объявлен единственный коннектор с SSLEnabled="true", использующий этот сертификат; http-коннектора нет, поэтому запросы без шифрования отклоняются.</w:t>
+        <w:t xml:space="preserve">Самоподписанный сертификат создан утилитой keytool. Файлы keystore.p12 и truststore.p12 лежат в репозитории, пути к ним и пароли указаны в server.xml Tomcat и в application.properties Booking Service. В server.xml есть только https-коннектор, поэтому запросы по http отклоняются.</w:t>
       </w:r>
     </w:p>
     <w:p>
@@ -1604,7 +1594,7 @@
         <w:spacing w:after="120" w:line="300" w:lineRule="auto"/>
       </w:pPr>
       <w:r>
-        <w:t>Клиент написан на React 18, собирается Vite в статические файлы и содержит три вкладки: билеты, люди и бронирования. Для каждой коллекции доступны все операции API: просмотр страницы с фильтрацией по любому полю, многоуровневой сортировкой и постраничным выводом, получение, создание, частичное обновление и удаление элемента, а также специальные операции: удаление любого билета заданного типа, продажа VIP-копии билета и отмена всех бронирований человека. Данные выводятся таблицами, ошибки сервисов показываются с кодом ответа, сообщением и списком нарушений по полям; полученный от сервиса JSON можно раскрыть под результатом. В форме элемента пустые поля не отправляются, а значение null очищает поле при частичном обновлении.</w:t>
+        <w:t xml:space="preserve">Клиент написан на React. Для каждой коллекции есть список с фильтрацией по любому полю, многоуровневой сортировкой и постраничным выводом, получение, создание, частичное обновление и удаление элемента, а также специальные операции. Данные выводятся таблицами. При ошибке показываются код ответа, сообщение и список нарушений по полям.</w:t>
       </w:r>
     </w:p>
     <w:p>
@@ -1907,7 +1897,7 @@
         <w:spacing w:after="120" w:line="300" w:lineRule="auto"/>
       </w:pPr>
       <w:r>
-        <w:t>Интерактивная документация из первой лабораторной работы направлена на развёрнутые сервисы: в спецификациях указаны их публичные https-адреса, поэтому операции можно выполнять прямо из Swagger UI.</w:t>
+        <w:t xml:space="preserve">В спецификациях указаны публичные https-адреса сервисов, поэтому операции можно выполнять прямо из Swagger UI.</w:t>
       </w:r>
     </w:p>
     <w:p>
@@ -1999,7 +1989,7 @@
         <w:spacing w:after="120" w:line="300" w:lineRule="auto"/>
       </w:pPr>
       <w:r>
-        <w:t>Во время выполнения лабораторной работы по спецификации OpenAPI из первой лабораторной работы были реализованы три веб-сервиса на Spring MVC REST и клиентское приложение. Мы научились генерировать интерфейсы контроллеров, модели и REST-клиентов из спецификации с помощью openapi-generator, разделять сервис на контроллеры, сервисы и репозитории, реализовывать фильтрацию, сортировку и постраничную выборку, возвращать ошибки валидации в едином формате с кодами 400, 404, 409 и 422. Сервисы развёрнуты в отдельных экземплярах Tomcat на helios с доступом только по https и самоподписанным сертификатом, созданным утилитой keytool; ключи и пароли указаны в конфигурации приложения, для межсервисного взаимодействия настроено хранилище доверенных сертификатов. Тексты ошибок вынесены в файлы сообщений, клиентское приложение написано на React.</w:t>
+        <w:t xml:space="preserve">Реализованы три веб-сервиса на Spring MVC REST и клиентское приложение на React. Мы научились генерировать контроллеры, модели и REST-клиенты из спецификации OpenAPI, реализовывать фильтрацию, сортировку и постраничную выборку, возвращать ошибки валидации в едином формате, разворачивать сервисы в отдельных экземплярах Tomcat с доступом только по https и самоподписанным сертификатом.</w:t>
       </w:r>
     </w:p>
     <w:sectPr>

</xml_diff>

<commit_message>
Update lab 2 report and export it to PDF
</commit_message>
<xml_diff>
--- a/SOA_lab2_67607_P3408.docx
+++ b/SOA_lab2_67607_P3408.docx
@@ -1911,7 +1911,7 @@
         </w:rPr>
         <w:drawing>
           <wp:inline distT="0" distB="0" distL="0" distR="0" wp14:anchorId="01BC5627" wp14:editId="3141BC88">
-            <wp:extent cx="5715000" cy="3390900"/>
+            <wp:extent cx="5715000" cy="3393281"/>
             <wp:effectExtent l="0" t="0" r="0" b="0"/>
             <wp:docPr id="5" name="Picture 5"/>
             <wp:cNvGraphicFramePr>
@@ -1936,7 +1936,7 @@
                   <pic:spPr bwMode="auto">
                     <a:xfrm>
                       <a:off x="0" y="0"/>
-                      <a:ext cx="5715000" cy="3390900"/>
+                      <a:ext cx="5715000" cy="3393281"/>
                     </a:xfrm>
                     <a:prstGeom prst="rect">
                       <a:avLst/>
@@ -1967,6 +1967,7 @@
     </w:p>
     <w:p>
       <w:pPr>
+        <w:keepNext/>
         <w:pStyle w:val="Heading1"/>
         <w:spacing w:before="240" w:after="160"/>
         <w:rPr>
@@ -1986,6 +1987,7 @@
     </w:p>
     <w:p>
       <w:pPr>
+        <w:keepLines/>
         <w:spacing w:after="120" w:line="300" w:lineRule="auto"/>
       </w:pPr>
       <w:r>

</xml_diff>

<commit_message>
Simplify HTTPS check and component table in the report
</commit_message>
<xml_diff>
--- a/SOA_lab2_67607_P3408.docx
+++ b/SOA_lab2_67607_P3408.docx
@@ -818,8 +818,7 @@
       </w:tblPr>
       <w:tblGrid>
         <w:gridCol w:w="2300"/>
-        <w:gridCol w:w="1500"/>
-        <w:gridCol w:w="5838"/>
+        <w:gridCol w:w="7338"/>
       </w:tblGrid>
       <w:tr>
         <w:tc>
@@ -853,36 +852,7 @@
         </w:tc>
         <w:tc>
           <w:tcPr>
-            <w:tcW w:w="1500" w:type="dxa"/>
-            <w:tcBorders>
-              <w:top w:val="single" w:sz="4" w:space="0" w:color="AAAAAA"/>
-              <w:left w:val="single" w:sz="4" w:space="0" w:color="AAAAAA"/>
-              <w:bottom w:val="single" w:sz="4" w:space="0" w:color="AAAAAA"/>
-              <w:right w:val="single" w:sz="4" w:space="0" w:color="AAAAAA"/>
-            </w:tcBorders>
-            <w:shd w:val="clear" w:color="auto" w:fill="EDEDED"/>
-            <w:tcMar>
-              <w:top w:w="60" w:type="dxa"/>
-              <w:left w:w="100" w:type="dxa"/>
-              <w:bottom w:w="60" w:type="dxa"/>
-              <w:right w:w="100" w:type="dxa"/>
-            </w:tcMar>
-          </w:tcPr>
-          <w:p>
-            <w:r>
-              <w:rPr>
-                <w:b/>
-                <w:bCs/>
-                <w:sz w:val="22"/>
-                <w:szCs w:val="22"/>
-              </w:rPr>
-              <w:t>Порт Tomcat</w:t>
-            </w:r>
-          </w:p>
-        </w:tc>
-        <w:tc>
-          <w:tcPr>
-            <w:tcW w:w="5838" w:type="dxa"/>
+            <w:tcW w:w="7338" w:type="dxa"/>
             <w:tcBorders>
               <w:top w:val="single" w:sz="4" w:space="0" w:color="AAAAAA"/>
               <w:left w:val="single" w:sz="4" w:space="0" w:color="AAAAAA"/>
@@ -939,33 +909,7 @@
         </w:tc>
         <w:tc>
           <w:tcPr>
-            <w:tcW w:w="1500" w:type="dxa"/>
-            <w:tcBorders>
-              <w:top w:val="single" w:sz="4" w:space="0" w:color="AAAAAA"/>
-              <w:left w:val="single" w:sz="4" w:space="0" w:color="AAAAAA"/>
-              <w:bottom w:val="single" w:sz="4" w:space="0" w:color="AAAAAA"/>
-              <w:right w:val="single" w:sz="4" w:space="0" w:color="AAAAAA"/>
-            </w:tcBorders>
-            <w:tcMar>
-              <w:top w:w="60" w:type="dxa"/>
-              <w:left w:w="100" w:type="dxa"/>
-              <w:bottom w:w="60" w:type="dxa"/>
-              <w:right w:w="100" w:type="dxa"/>
-            </w:tcMar>
-          </w:tcPr>
-          <w:p>
-            <w:r>
-              <w:rPr>
-                <w:sz w:val="22"/>
-                <w:szCs w:val="22"/>
-              </w:rPr>
-              <w:t>41390</w:t>
-            </w:r>
-          </w:p>
-        </w:tc>
-        <w:tc>
-          <w:tcPr>
-            <w:tcW w:w="5838" w:type="dxa"/>
+            <w:tcW w:w="7338" w:type="dxa"/>
             <w:tcBorders>
               <w:top w:val="single" w:sz="4" w:space="0" w:color="AAAAAA"/>
               <w:left w:val="single" w:sz="4" w:space="0" w:color="AAAAAA"/>
@@ -1019,33 +963,7 @@
         </w:tc>
         <w:tc>
           <w:tcPr>
-            <w:tcW w:w="1500" w:type="dxa"/>
-            <w:tcBorders>
-              <w:top w:val="single" w:sz="4" w:space="0" w:color="AAAAAA"/>
-              <w:left w:val="single" w:sz="4" w:space="0" w:color="AAAAAA"/>
-              <w:bottom w:val="single" w:sz="4" w:space="0" w:color="AAAAAA"/>
-              <w:right w:val="single" w:sz="4" w:space="0" w:color="AAAAAA"/>
-            </w:tcBorders>
-            <w:tcMar>
-              <w:top w:w="60" w:type="dxa"/>
-              <w:left w:w="100" w:type="dxa"/>
-              <w:bottom w:w="60" w:type="dxa"/>
-              <w:right w:w="100" w:type="dxa"/>
-            </w:tcMar>
-          </w:tcPr>
-          <w:p>
-            <w:r>
-              <w:rPr>
-                <w:sz w:val="22"/>
-                <w:szCs w:val="22"/>
-              </w:rPr>
-              <w:t>41391</w:t>
-            </w:r>
-          </w:p>
-        </w:tc>
-        <w:tc>
-          <w:tcPr>
-            <w:tcW w:w="5838" w:type="dxa"/>
+            <w:tcW w:w="7338" w:type="dxa"/>
             <w:tcBorders>
               <w:top w:val="single" w:sz="4" w:space="0" w:color="AAAAAA"/>
               <w:left w:val="single" w:sz="4" w:space="0" w:color="AAAAAA"/>
@@ -1099,33 +1017,7 @@
         </w:tc>
         <w:tc>
           <w:tcPr>
-            <w:tcW w:w="1500" w:type="dxa"/>
-            <w:tcBorders>
-              <w:top w:val="single" w:sz="4" w:space="0" w:color="AAAAAA"/>
-              <w:left w:val="single" w:sz="4" w:space="0" w:color="AAAAAA"/>
-              <w:bottom w:val="single" w:sz="4" w:space="0" w:color="AAAAAA"/>
-              <w:right w:val="single" w:sz="4" w:space="0" w:color="AAAAAA"/>
-            </w:tcBorders>
-            <w:tcMar>
-              <w:top w:w="60" w:type="dxa"/>
-              <w:left w:w="100" w:type="dxa"/>
-              <w:bottom w:w="60" w:type="dxa"/>
-              <w:right w:w="100" w:type="dxa"/>
-            </w:tcMar>
-          </w:tcPr>
-          <w:p>
-            <w:r>
-              <w:rPr>
-                <w:sz w:val="22"/>
-                <w:szCs w:val="22"/>
-              </w:rPr>
-              <w:t>41392</w:t>
-            </w:r>
-          </w:p>
-        </w:tc>
-        <w:tc>
-          <w:tcPr>
-            <w:tcW w:w="5838" w:type="dxa"/>
+            <w:tcW w:w="7338" w:type="dxa"/>
             <w:tcBorders>
               <w:top w:val="single" w:sz="4" w:space="0" w:color="AAAAAA"/>
               <w:left w:val="single" w:sz="4" w:space="0" w:color="AAAAAA"/>
@@ -1179,33 +1071,7 @@
         </w:tc>
         <w:tc>
           <w:tcPr>
-            <w:tcW w:w="1500" w:type="dxa"/>
-            <w:tcBorders>
-              <w:top w:val="single" w:sz="4" w:space="0" w:color="AAAAAA"/>
-              <w:left w:val="single" w:sz="4" w:space="0" w:color="AAAAAA"/>
-              <w:bottom w:val="single" w:sz="4" w:space="0" w:color="AAAAAA"/>
-              <w:right w:val="single" w:sz="4" w:space="0" w:color="AAAAAA"/>
-            </w:tcBorders>
-            <w:tcMar>
-              <w:top w:w="60" w:type="dxa"/>
-              <w:left w:w="100" w:type="dxa"/>
-              <w:bottom w:w="60" w:type="dxa"/>
-              <w:right w:w="100" w:type="dxa"/>
-            </w:tcMar>
-          </w:tcPr>
-          <w:p>
-            <w:r>
-              <w:rPr>
-                <w:sz w:val="22"/>
-                <w:szCs w:val="22"/>
-              </w:rPr>
-              <w:t>-</w:t>
-            </w:r>
-          </w:p>
-        </w:tc>
-        <w:tc>
-          <w:tcPr>
-            <w:tcW w:w="5838" w:type="dxa"/>
+            <w:tcW w:w="7338" w:type="dxa"/>
             <w:tcBorders>
               <w:top w:val="single" w:sz="4" w:space="0" w:color="AAAAAA"/>
               <w:left w:val="single" w:sz="4" w:space="0" w:color="AAAAAA"/>
@@ -1259,33 +1125,7 @@
         </w:tc>
         <w:tc>
           <w:tcPr>
-            <w:tcW w:w="1500" w:type="dxa"/>
-            <w:tcBorders>
-              <w:top w:val="single" w:sz="4" w:space="0" w:color="AAAAAA"/>
-              <w:left w:val="single" w:sz="4" w:space="0" w:color="AAAAAA"/>
-              <w:bottom w:val="single" w:sz="4" w:space="0" w:color="AAAAAA"/>
-              <w:right w:val="single" w:sz="4" w:space="0" w:color="AAAAAA"/>
-            </w:tcBorders>
-            <w:tcMar>
-              <w:top w:w="60" w:type="dxa"/>
-              <w:left w:w="100" w:type="dxa"/>
-              <w:bottom w:w="60" w:type="dxa"/>
-              <w:right w:w="100" w:type="dxa"/>
-            </w:tcMar>
-          </w:tcPr>
-          <w:p>
-            <w:r>
-              <w:rPr>
-                <w:sz w:val="22"/>
-                <w:szCs w:val="22"/>
-              </w:rPr>
-              <w:t>-</w:t>
-            </w:r>
-          </w:p>
-        </w:tc>
-        <w:tc>
-          <w:tcPr>
-            <w:tcW w:w="5838" w:type="dxa"/>
+            <w:tcW w:w="7338" w:type="dxa"/>
             <w:tcBorders>
               <w:top w:val="single" w:sz="4" w:space="0" w:color="AAAAAA"/>
               <w:left w:val="single" w:sz="4" w:space="0" w:color="AAAAAA"/>
@@ -1408,7 +1248,7 @@
           <w:sz w:val="18"/>
           <w:szCs w:val="18"/>
         </w:rPr>
-        <w:t xml:space="preserve"> </w:t>
+        <w:t>$ curl https://localhost:41390/tickets</w:t>
       </w:r>
     </w:p>
     <w:p>
@@ -1421,7 +1261,7 @@
           <w:sz w:val="18"/>
           <w:szCs w:val="18"/>
         </w:rPr>
-        <w:t>$ curl https://localhost:41390/tickets</w:t>
+        <w:t>curl: (60) SSL certificate problem: self-signed certificate</w:t>
       </w:r>
     </w:p>
     <w:p>
@@ -1434,7 +1274,7 @@
           <w:sz w:val="18"/>
           <w:szCs w:val="18"/>
         </w:rPr>
-        <w:t>curl: (60) SSL certificate problem: self-signed certificate</w:t>
+        <w:t xml:space="preserve"> </w:t>
       </w:r>
     </w:p>
     <w:p>
@@ -1447,12 +1287,13 @@
           <w:sz w:val="18"/>
           <w:szCs w:val="18"/>
         </w:rPr>
-        <w:t xml:space="preserve"> </w:t>
+        <w:t xml:space="preserve">$ curl --cacert ~/public_html/ticket-service/server.crt https://localhost:41390/tickets/2</w:t>
       </w:r>
     </w:p>
     <w:p>
       <w:pPr>
         <w:shd w:val="clear" w:color="auto" w:fill="F2F2F2"/>
+        <w:spacing w:after="160"/>
       </w:pPr>
       <w:r>
         <w:rPr>
@@ -1460,100 +1301,7 @@
           <w:sz w:val="18"/>
           <w:szCs w:val="18"/>
         </w:rPr>
-        <w:t>$ curl --cacert ~/public_html/ticket-service/server.crt -o /dev/null -w "%{http_code}" https://localhost:41390/tickets</w:t>
-      </w:r>
-    </w:p>
-    <w:p>
-      <w:pPr>
-        <w:shd w:val="clear" w:color="auto" w:fill="F2F2F2"/>
-      </w:pPr>
-      <w:r>
-        <w:rPr>
-          <w:rFonts w:ascii="Courier New" w:eastAsia="Courier New" w:hAnsi="Courier New" w:cs="Courier New"/>
-          <w:sz w:val="18"/>
-          <w:szCs w:val="18"/>
-        </w:rPr>
-        <w:t>200</w:t>
-      </w:r>
-    </w:p>
-    <w:p>
-      <w:pPr>
-        <w:shd w:val="clear" w:color="auto" w:fill="F2F2F2"/>
-      </w:pPr>
-      <w:r>
-        <w:rPr>
-          <w:rFonts w:ascii="Courier New" w:eastAsia="Courier New" w:hAnsi="Courier New" w:cs="Courier New"/>
-          <w:sz w:val="18"/>
-          <w:szCs w:val="18"/>
-        </w:rPr>
-        <w:lastRenderedPageBreak/>
-        <w:t xml:space="preserve"> </w:t>
-      </w:r>
-    </w:p>
-    <w:p>
-      <w:pPr>
-        <w:shd w:val="clear" w:color="auto" w:fill="F2F2F2"/>
-      </w:pPr>
-      <w:r>
-        <w:rPr>
-          <w:rFonts w:ascii="Courier New" w:eastAsia="Courier New" w:hAnsi="Courier New" w:cs="Courier New"/>
-          <w:sz w:val="18"/>
-          <w:szCs w:val="18"/>
-        </w:rPr>
-        <w:t>$ openssl x509 -in ~/public_html/ticket-service/server.crt -noout -subject -issuer -ext subjectAltName</w:t>
-      </w:r>
-    </w:p>
-    <w:p>
-      <w:pPr>
-        <w:shd w:val="clear" w:color="auto" w:fill="F2F2F2"/>
-      </w:pPr>
-      <w:r>
-        <w:rPr>
-          <w:rFonts w:ascii="Courier New" w:eastAsia="Courier New" w:hAnsi="Courier New" w:cs="Courier New"/>
-          <w:sz w:val="18"/>
-          <w:szCs w:val="18"/>
-        </w:rPr>
-        <w:t>subject=CN = helios.cs.ifmo.ru</w:t>
-      </w:r>
-    </w:p>
-    <w:p>
-      <w:pPr>
-        <w:shd w:val="clear" w:color="auto" w:fill="F2F2F2"/>
-      </w:pPr>
-      <w:r>
-        <w:rPr>
-          <w:rFonts w:ascii="Courier New" w:eastAsia="Courier New" w:hAnsi="Courier New" w:cs="Courier New"/>
-          <w:sz w:val="18"/>
-          <w:szCs w:val="18"/>
-        </w:rPr>
-        <w:t>issuer=CN = helios.cs.ifmo.ru</w:t>
-      </w:r>
-    </w:p>
-    <w:p>
-      <w:pPr>
-        <w:shd w:val="clear" w:color="auto" w:fill="F2F2F2"/>
-      </w:pPr>
-      <w:r>
-        <w:rPr>
-          <w:rFonts w:ascii="Courier New" w:eastAsia="Courier New" w:hAnsi="Courier New" w:cs="Courier New"/>
-          <w:sz w:val="18"/>
-          <w:szCs w:val="18"/>
-        </w:rPr>
-        <w:t xml:space="preserve">X509v3 Subject Alternative Name: </w:t>
-      </w:r>
-    </w:p>
-    <w:p>
-      <w:pPr>
-        <w:shd w:val="clear" w:color="auto" w:fill="F2F2F2"/>
-        <w:spacing w:after="160"/>
-      </w:pPr>
-      <w:r>
-        <w:rPr>
-          <w:rFonts w:ascii="Courier New" w:eastAsia="Courier New" w:hAnsi="Courier New" w:cs="Courier New"/>
-          <w:sz w:val="18"/>
-          <w:szCs w:val="18"/>
-        </w:rPr>
-        <w:t xml:space="preserve">    DNS:localhost, DNS:helios.cs.ifmo.ru, IP Address:127.0.0.1</w:t>
+        <w:t xml:space="preserve">{"id":2,"name":"2222","coordinates":{"x":1.0,"y":2.0},"creationDate":"2026-10-09T19:30:31.184Z","price":null,"comment":"","type":null,"venue":null}</w:t>
       </w:r>
     </w:p>
     <w:p>

</xml_diff>